<commit_message>
docs: update scope of work and docx generator
</commit_message>
<xml_diff>
--- a/docs/ABC_Safety_Solutions_Scope_of_Work.docx
+++ b/docs/ABC_Safety_Solutions_Scope_of_Work.docx
@@ -119,6 +119,14 @@
         <w:pStyle w:val="ListBullet"/>
       </w:pPr>
       <w:r>
+        <w:t>Support category-level certificate wording controlled by admin, so each training discipline can display its own certification text.</w:t>
+      </w:r>
+    </w:p>
+    <w:p>
+      <w:pPr>
+        <w:pStyle w:val="ListBullet"/>
+      </w:pPr>
+      <w:r>
         <w:t>Email the certificate automatically and store it in the learner’s web and app account.</w:t>
       </w:r>
     </w:p>
@@ -199,7 +207,7 @@
         <w:pStyle w:val="ListBullet"/>
       </w:pPr>
       <w:r>
-        <w:t>Certificates: PDF from client‑provided template; fields include learner name, course title, completion date; delivery by email and download in dashboard</w:t>
+        <w:t>Certificates: branded layout with prominent blue company logo; includes learner name, course title, completion date, and category-specific certification text; delivery by email and dashboard download</w:t>
       </w:r>
     </w:p>
     <w:p>
@@ -215,7 +223,7 @@
         <w:pStyle w:val="ListBullet"/>
       </w:pPr>
       <w:r>
-        <w:t>Admin panel: manage courses, media, tests, pricing, users/orders, and announcements</w:t>
+        <w:t>Admin panel: manage courses, media, tests, pricing, users/orders, announcements, and category certificate text</w:t>
       </w:r>
     </w:p>
     <w:p>
@@ -224,6 +232,14 @@
       </w:pPr>
       <w:r>
         <w:t>Responsive layout for phones and tablets</w:t>
+      </w:r>
+    </w:p>
+    <w:p>
+      <w:pPr>
+        <w:pStyle w:val="ListBullet"/>
+      </w:pPr>
+      <w:r>
+        <w:t>Deployment-ready configuration for Vercel builds and Cloudflare Pages static build upload</w:t>
       </w:r>
     </w:p>
     <w:p>
@@ -496,6 +512,62 @@
               <w:rPr>
                 <w:sz w:val="20"/>
               </w:rPr>
+              <w:t>Certificate content</w:t>
+            </w:r>
+          </w:p>
+        </w:tc>
+        <w:tc>
+          <w:tcPr>
+            <w:tcW w:type="dxa" w:w="4320"/>
+          </w:tcPr>
+          <w:p>
+            <w:r>
+              <w:rPr>
+                <w:sz w:val="20"/>
+              </w:rPr>
+              <w:t>Admin can set/edit category-level certification text shown on certificates.</w:t>
+            </w:r>
+          </w:p>
+        </w:tc>
+      </w:tr>
+      <w:tr>
+        <w:tc>
+          <w:tcPr>
+            <w:tcW w:type="dxa" w:w="4320"/>
+          </w:tcPr>
+          <w:p>
+            <w:r>
+              <w:rPr>
+                <w:sz w:val="20"/>
+              </w:rPr>
+              <w:t>Branding on certificate</w:t>
+            </w:r>
+          </w:p>
+        </w:tc>
+        <w:tc>
+          <w:tcPr>
+            <w:tcW w:type="dxa" w:w="4320"/>
+          </w:tcPr>
+          <w:p>
+            <w:r>
+              <w:rPr>
+                <w:sz w:val="20"/>
+              </w:rPr>
+              <w:t>Main blue web app logo is prominently displayed in certificate header.</w:t>
+            </w:r>
+          </w:p>
+        </w:tc>
+      </w:tr>
+      <w:tr>
+        <w:tc>
+          <w:tcPr>
+            <w:tcW w:type="dxa" w:w="4320"/>
+          </w:tcPr>
+          <w:p>
+            <w:r>
+              <w:rPr>
+                <w:sz w:val="20"/>
+              </w:rPr>
               <w:t>Admin</w:t>
             </w:r>
           </w:p>
@@ -538,6 +610,34 @@
                 <w:sz w:val="20"/>
               </w:rPr>
               <w:t>Same learning and certificates as web; reminders and announcements supported.</w:t>
+            </w:r>
+          </w:p>
+        </w:tc>
+      </w:tr>
+      <w:tr>
+        <w:tc>
+          <w:tcPr>
+            <w:tcW w:type="dxa" w:w="4320"/>
+          </w:tcPr>
+          <w:p>
+            <w:r>
+              <w:rPr>
+                <w:sz w:val="20"/>
+              </w:rPr>
+              <w:t>Deployment</w:t>
+            </w:r>
+          </w:p>
+        </w:tc>
+        <w:tc>
+          <w:tcPr>
+            <w:tcW w:type="dxa" w:w="4320"/>
+          </w:tcPr>
+          <w:p>
+            <w:r>
+              <w:rPr>
+                <w:sz w:val="20"/>
+              </w:rPr>
+              <w:t>Configured for Vercel production builds and Cloudflare Pages `dist` uploads.</w:t>
             </w:r>
           </w:p>
         </w:tc>

</xml_diff>